<commit_message>
cập nhật ngày 4/1/2026
</commit_message>
<xml_diff>
--- a/git.docx
+++ b/git.docx
@@ -206,11 +206,6 @@
     <w:p>
       <w:r>
         <w:t>Sau này khi bạn sửa file hoặc tạo thêm file mới, bạn chỉ cần lặp lại đúng 3 lệnh ngắn gọn này là code sẽ cập nhật lên GitHub:</w:t>
-      </w:r>
-    </w:p>
-    <w:p>
-      <w:r>
-        <w:t>Bash</w:t>
       </w:r>
     </w:p>
     <w:p>
@@ -1398,6 +1393,7 @@
   <w:style w:type="character" w:default="1" w:styleId="DefaultParagraphFont">
     <w:name w:val="Default Paragraph Font"/>
     <w:uiPriority w:val="1"/>
+    <w:semiHidden/>
     <w:unhideWhenUsed/>
   </w:style>
   <w:style w:type="table" w:default="1" w:styleId="TableNormal">

</xml_diff>